<commit_message>
IACUC: fix team/animal column alignment (unwrap content controls), left-align answer boxes, fix Day duplication & literature dict; study plan per-group timeline; blood recalibration; IM route
Co-Authored-By: Claude Opus 4.8 <noreply@anthropic.com>
</commit_message>
<xml_diff>
--- a/iacuc_assets/iacuc_template.docx
+++ b/iacuc_assets/iacuc_template.docx
@@ -3529,9 +3529,6 @@
                 </w:r>
               </w:sdtContent>
             </w:sdt>
-            <w:r>
-              <w:t xml:space="preserve">{{ team[0].name if team|length &gt; 0 else '' }}</w:t>
-            </w:r>
           </w:p>
         </w:tc>
         <w:tc>
@@ -3547,9 +3544,6 @@
                 <w:szCs w:val="16"/>
               </w:rPr>
             </w:pPr>
-            <w:r>
-              <w:t xml:space="preserve">{{ team[0].role if team|length &gt; 0 else '' }}</w:t>
-            </w:r>
           </w:p>
         </w:tc>
         <w:tc>
@@ -3565,9 +3559,6 @@
                 <w:szCs w:val="16"/>
               </w:rPr>
             </w:pPr>
-            <w:r>
-              <w:t xml:space="preserve">{{ team[0].qualifications if team|length &gt; 0 else '' }}</w:t>
-            </w:r>
           </w:p>
         </w:tc>
         <w:tc>
@@ -3583,9 +3574,6 @@
                 <w:szCs w:val="16"/>
               </w:rPr>
             </w:pPr>
-            <w:r>
-              <w:t xml:space="preserve">{{ team[0].institution if team|length &gt; 0 else '' }}</w:t>
-            </w:r>
           </w:p>
         </w:tc>
         <w:tc>
@@ -3601,9 +3589,6 @@
                 <w:szCs w:val="16"/>
               </w:rPr>
             </w:pPr>
-            <w:r>
-              <w:t xml:space="preserve">{{ team[0].email if team|length &gt; 0 else '' }}</w:t>
-            </w:r>
           </w:p>
         </w:tc>
       </w:tr>
@@ -3703,9 +3688,6 @@
                 </w:r>
               </w:sdtContent>
             </w:sdt>
-            <w:r>
-              <w:t xml:space="preserve">{{ team[0].mobile if team|length &gt; 0 else '' }}</w:t>
-            </w:r>
           </w:p>
         </w:tc>
         <w:tc>
@@ -3721,9 +3703,6 @@
                 <w:szCs w:val="16"/>
               </w:rPr>
             </w:pPr>
-            <w:r>
-              <w:t xml:space="preserve">{{ team[1].name if team|length &gt; 1 else '' }}</w:t>
-            </w:r>
           </w:p>
         </w:tc>
         <w:tc>
@@ -3739,9 +3718,6 @@
                 <w:szCs w:val="16"/>
               </w:rPr>
             </w:pPr>
-            <w:r>
-              <w:t xml:space="preserve">{{ team[1].role if team|length &gt; 1 else '' }}</w:t>
-            </w:r>
           </w:p>
         </w:tc>
         <w:tc>
@@ -3757,9 +3733,6 @@
                 <w:szCs w:val="16"/>
               </w:rPr>
             </w:pPr>
-            <w:r>
-              <w:t xml:space="preserve">{{ team[1].qualifications if team|length &gt; 1 else '' }}</w:t>
-            </w:r>
           </w:p>
         </w:tc>
         <w:tc>
@@ -3775,9 +3748,6 @@
                 <w:szCs w:val="16"/>
               </w:rPr>
             </w:pPr>
-            <w:r>
-              <w:t xml:space="preserve">{{ team[1].institution if team|length &gt; 1 else '' }}</w:t>
-            </w:r>
           </w:p>
         </w:tc>
       </w:tr>
@@ -3877,9 +3847,6 @@
                 </w:r>
               </w:sdtContent>
             </w:sdt>
-            <w:r>
-              <w:t xml:space="preserve">{{ team[1].email if team|length &gt; 1 else '' }}</w:t>
-            </w:r>
           </w:p>
         </w:tc>
         <w:tc>
@@ -3895,9 +3862,6 @@
                 <w:szCs w:val="16"/>
               </w:rPr>
             </w:pPr>
-            <w:r>
-              <w:t xml:space="preserve">{{ team[1].mobile if team|length &gt; 1 else '' }}</w:t>
-            </w:r>
           </w:p>
         </w:tc>
         <w:tc>
@@ -3913,9 +3877,6 @@
                 <w:szCs w:val="16"/>
               </w:rPr>
             </w:pPr>
-            <w:r>
-              <w:t xml:space="preserve">{{ team[2].name if team|length &gt; 2 else '' }}</w:t>
-            </w:r>
           </w:p>
         </w:tc>
         <w:tc>
@@ -3931,9 +3892,6 @@
                 <w:szCs w:val="16"/>
               </w:rPr>
             </w:pPr>
-            <w:r>
-              <w:t xml:space="preserve">{{ team[2].role if team|length &gt; 2 else '' }}</w:t>
-            </w:r>
           </w:p>
         </w:tc>
         <w:tc>
@@ -3949,9 +3907,6 @@
                 <w:szCs w:val="16"/>
               </w:rPr>
             </w:pPr>
-            <w:r>
-              <w:t xml:space="preserve">{{ team[2].qualifications if team|length &gt; 2 else '' }}</w:t>
-            </w:r>
           </w:p>
         </w:tc>
       </w:tr>
@@ -4051,9 +4006,6 @@
                 </w:r>
               </w:sdtContent>
             </w:sdt>
-            <w:r>
-              <w:t xml:space="preserve">{{ team[2].institution if team|length &gt; 2 else '' }}</w:t>
-            </w:r>
           </w:p>
         </w:tc>
         <w:tc>
@@ -4069,9 +4021,6 @@
                 <w:szCs w:val="16"/>
               </w:rPr>
             </w:pPr>
-            <w:r>
-              <w:t xml:space="preserve">{{ team[2].email if team|length &gt; 2 else '' }}</w:t>
-            </w:r>
           </w:p>
         </w:tc>
         <w:tc>
@@ -4087,9 +4036,6 @@
                 <w:szCs w:val="16"/>
               </w:rPr>
             </w:pPr>
-            <w:r>
-              <w:t xml:space="preserve">{{ team[2].mobile if team|length &gt; 2 else '' }}</w:t>
-            </w:r>
           </w:p>
         </w:tc>
         <w:tc>
@@ -4105,9 +4051,6 @@
                 <w:szCs w:val="16"/>
               </w:rPr>
             </w:pPr>
-            <w:r>
-              <w:t xml:space="preserve">{{ team[3].name if team|length &gt; 3 else '' }}</w:t>
-            </w:r>
           </w:p>
         </w:tc>
         <w:tc>
@@ -4123,9 +4066,6 @@
                 <w:szCs w:val="16"/>
               </w:rPr>
             </w:pPr>
-            <w:r>
-              <w:t xml:space="preserve">{{ team[3].role if team|length &gt; 3 else '' }}</w:t>
-            </w:r>
           </w:p>
         </w:tc>
       </w:tr>
@@ -4224,9 +4164,6 @@
                 </w:r>
               </w:sdtContent>
             </w:sdt>
-            <w:r>
-              <w:t xml:space="preserve">{{ team[3].qualifications if team|length &gt; 3 else '' }}</w:t>
-            </w:r>
           </w:p>
         </w:tc>
         <w:tc>
@@ -4242,9 +4179,6 @@
                 <w:szCs w:val="16"/>
               </w:rPr>
             </w:pPr>
-            <w:r>
-              <w:t xml:space="preserve">{{ team[3].institution if team|length &gt; 3 else '' }}</w:t>
-            </w:r>
           </w:p>
         </w:tc>
         <w:tc>
@@ -4260,9 +4194,6 @@
                 <w:szCs w:val="16"/>
               </w:rPr>
             </w:pPr>
-            <w:r>
-              <w:t xml:space="preserve">{{ team[3].email if team|length &gt; 3 else '' }}</w:t>
-            </w:r>
           </w:p>
         </w:tc>
         <w:tc>
@@ -4278,9 +4209,6 @@
                 <w:szCs w:val="16"/>
               </w:rPr>
             </w:pPr>
-            <w:r>
-              <w:t xml:space="preserve">{{ team[3].mobile if team|length &gt; 3 else '' }}</w:t>
-            </w:r>
           </w:p>
         </w:tc>
         <w:tc>
@@ -4296,9 +4224,6 @@
                 <w:szCs w:val="16"/>
               </w:rPr>
             </w:pPr>
-            <w:r>
-              <w:t xml:space="preserve">{{ team[4].name if team|length &gt; 4 else '' }}</w:t>
-            </w:r>
           </w:p>
         </w:tc>
       </w:tr>
@@ -4314,9 +4239,6 @@
                 <w:szCs w:val="18"/>
               </w:rPr>
             </w:pPr>
-            <w:r>
-              <w:t xml:space="preserve">{{ team[4].role if team|length &gt; 4 else '' }}</w:t>
-            </w:r>
           </w:p>
         </w:tc>
         <w:tc>
@@ -4331,9 +4253,6 @@
                 <w:szCs w:val="18"/>
               </w:rPr>
             </w:pPr>
-            <w:r>
-              <w:t xml:space="preserve">{{ team[4].qualifications if team|length &gt; 4 else '' }}</w:t>
-            </w:r>
           </w:p>
         </w:tc>
         <w:tc>
@@ -4349,9 +4268,6 @@
                 <w:szCs w:val="16"/>
               </w:rPr>
             </w:pPr>
-            <w:r>
-              <w:t xml:space="preserve">{{ team[4].institution if team|length &gt; 4 else '' }}</w:t>
-            </w:r>
           </w:p>
         </w:tc>
         <w:tc>
@@ -4367,9 +4283,6 @@
                 <w:szCs w:val="16"/>
               </w:rPr>
             </w:pPr>
-            <w:r>
-              <w:t xml:space="preserve">{{ team[4].email if team|length &gt; 4 else '' }}</w:t>
-            </w:r>
           </w:p>
         </w:tc>
         <w:tc>
@@ -4385,9 +4298,6 @@
                 <w:szCs w:val="16"/>
               </w:rPr>
             </w:pPr>
-            <w:r>
-              <w:t xml:space="preserve">{{ team[4].mobile if team|length &gt; 4 else '' }}</w:t>
-            </w:r>
           </w:p>
         </w:tc>
         <w:tc>
@@ -4403,9 +4313,6 @@
                 <w:szCs w:val="16"/>
               </w:rPr>
             </w:pPr>
-            <w:r>
-              <w:t xml:space="preserve">{{ team[5].name if team|length &gt; 5 else '' }}</w:t>
-            </w:r>
           </w:p>
         </w:tc>
       </w:tr>
@@ -4421,9 +4328,6 @@
                 <w:szCs w:val="18"/>
               </w:rPr>
             </w:pPr>
-            <w:r>
-              <w:t xml:space="preserve">{{ team[5].role if team|length &gt; 5 else '' }}</w:t>
-            </w:r>
           </w:p>
         </w:tc>
         <w:tc>
@@ -4438,9 +4342,6 @@
                 <w:szCs w:val="18"/>
               </w:rPr>
             </w:pPr>
-            <w:r>
-              <w:t xml:space="preserve">{{ team[5].qualifications if team|length &gt; 5 else '' }}</w:t>
-            </w:r>
           </w:p>
         </w:tc>
         <w:tc>
@@ -4456,9 +4357,6 @@
                 <w:szCs w:val="16"/>
               </w:rPr>
             </w:pPr>
-            <w:r>
-              <w:t xml:space="preserve">{{ team[5].institution if team|length &gt; 5 else '' }}</w:t>
-            </w:r>
           </w:p>
         </w:tc>
         <w:tc>
@@ -4474,9 +4372,6 @@
                 <w:szCs w:val="16"/>
               </w:rPr>
             </w:pPr>
-            <w:r>
-              <w:t xml:space="preserve">{{ team[5].email if team|length &gt; 5 else '' }}</w:t>
-            </w:r>
           </w:p>
         </w:tc>
         <w:tc>
@@ -4492,9 +4387,6 @@
                 <w:szCs w:val="16"/>
               </w:rPr>
             </w:pPr>
-            <w:r>
-              <w:t xml:space="preserve">{{ team[5].mobile if team|length &gt; 5 else '' }}</w:t>
-            </w:r>
           </w:p>
         </w:tc>
         <w:tc>
@@ -9336,9 +9228,6 @@
             <w:pPr>
               <w:jc w:val="left"/>
             </w:pPr>
-            <w:r>
-              <w:t xml:space="preserve">{{ animals[0].species if animals|length &gt; 0 else '' }}</w:t>
-            </w:r>
           </w:p>
         </w:tc>
         <w:tc>
@@ -9349,9 +9238,6 @@
             <w:pPr>
               <w:jc w:val="left"/>
             </w:pPr>
-            <w:r>
-              <w:t xml:space="preserve">{{ animals[0].strain if animals|length &gt; 0 else '' }}</w:t>
-            </w:r>
           </w:p>
         </w:tc>
         <w:tc>
@@ -9362,9 +9248,6 @@
             <w:pPr>
               <w:jc w:val="left"/>
             </w:pPr>
-            <w:r>
-              <w:t xml:space="preserve">{{ animals[0].sex if animals|length &gt; 0 else '' }}</w:t>
-            </w:r>
           </w:p>
         </w:tc>
         <w:tc>
@@ -9375,9 +9258,6 @@
             <w:pPr>
               <w:jc w:val="left"/>
             </w:pPr>
-            <w:r>
-              <w:t xml:space="preserve">{{ animals[0].age if animals|length &gt; 0 else '' }}</w:t>
-            </w:r>
           </w:p>
         </w:tc>
         <w:tc>
@@ -9388,9 +9268,6 @@
             <w:pPr>
               <w:jc w:val="left"/>
             </w:pPr>
-            <w:r>
-              <w:t xml:space="preserve">{{ animals[0].total if animals|length &gt; 0 else '' }}</w:t>
-            </w:r>
           </w:p>
         </w:tc>
         <w:tc>
@@ -9405,9 +9282,6 @@
                 <w:szCs w:val="20"/>
               </w:rPr>
             </w:pPr>
-            <w:r>
-              <w:t xml:space="preserve">{{ animals[0].source if animals|length &gt; 0 else '' }}</w:t>
-            </w:r>
           </w:p>
         </w:tc>
       </w:tr>
@@ -9420,9 +9294,6 @@
             <w:pPr>
               <w:jc w:val="left"/>
             </w:pPr>
-            <w:r>
-              <w:t xml:space="preserve">{{ animals[1].species if animals|length &gt; 1 else '' }}</w:t>
-            </w:r>
           </w:p>
         </w:tc>
         <w:tc>
@@ -9433,9 +9304,6 @@
             <w:pPr>
               <w:jc w:val="left"/>
             </w:pPr>
-            <w:r>
-              <w:t xml:space="preserve">{{ animals[1].strain if animals|length &gt; 1 else '' }}</w:t>
-            </w:r>
           </w:p>
         </w:tc>
         <w:tc>
@@ -9446,9 +9314,6 @@
             <w:pPr>
               <w:jc w:val="left"/>
             </w:pPr>
-            <w:r>
-              <w:t xml:space="preserve">{{ animals[1].sex if animals|length &gt; 1 else '' }}</w:t>
-            </w:r>
           </w:p>
         </w:tc>
         <w:tc>
@@ -9459,9 +9324,6 @@
             <w:pPr>
               <w:jc w:val="left"/>
             </w:pPr>
-            <w:r>
-              <w:t xml:space="preserve">{{ animals[1].age if animals|length &gt; 1 else '' }}</w:t>
-            </w:r>
           </w:p>
         </w:tc>
         <w:tc>
@@ -9472,9 +9334,6 @@
             <w:pPr>
               <w:jc w:val="left"/>
             </w:pPr>
-            <w:r>
-              <w:t xml:space="preserve">{{ animals[1].total if animals|length &gt; 1 else '' }}</w:t>
-            </w:r>
           </w:p>
         </w:tc>
         <w:tc>
@@ -9489,9 +9348,6 @@
                 <w:szCs w:val="20"/>
               </w:rPr>
             </w:pPr>
-            <w:r>
-              <w:t xml:space="preserve">{{ animals[1].source if animals|length &gt; 1 else '' }}</w:t>
-            </w:r>
           </w:p>
         </w:tc>
       </w:tr>
@@ -9504,9 +9360,6 @@
             <w:pPr>
               <w:jc w:val="left"/>
             </w:pPr>
-            <w:r>
-              <w:t xml:space="preserve">{{ animals[2].species if animals|length &gt; 2 else '' }}</w:t>
-            </w:r>
           </w:p>
         </w:tc>
         <w:tc>
@@ -9517,9 +9370,6 @@
             <w:pPr>
               <w:jc w:val="left"/>
             </w:pPr>
-            <w:r>
-              <w:t xml:space="preserve">{{ animals[2].strain if animals|length &gt; 2 else '' }}</w:t>
-            </w:r>
           </w:p>
         </w:tc>
         <w:tc>
@@ -9530,9 +9380,6 @@
             <w:pPr>
               <w:jc w:val="left"/>
             </w:pPr>
-            <w:r>
-              <w:t xml:space="preserve">{{ animals[2].sex if animals|length &gt; 2 else '' }}</w:t>
-            </w:r>
           </w:p>
         </w:tc>
         <w:tc>
@@ -9543,9 +9390,6 @@
             <w:pPr>
               <w:jc w:val="left"/>
             </w:pPr>
-            <w:r>
-              <w:t xml:space="preserve">{{ animals[2].age if animals|length &gt; 2 else '' }}</w:t>
-            </w:r>
           </w:p>
         </w:tc>
         <w:tc>
@@ -9556,9 +9400,6 @@
             <w:pPr>
               <w:jc w:val="left"/>
             </w:pPr>
-            <w:r>
-              <w:t xml:space="preserve">{{ animals[2].total if animals|length &gt; 2 else '' }}</w:t>
-            </w:r>
           </w:p>
         </w:tc>
         <w:tc>
@@ -9573,9 +9414,6 @@
                 <w:szCs w:val="20"/>
               </w:rPr>
             </w:pPr>
-            <w:r>
-              <w:t xml:space="preserve">{{ animals[2].source if animals|length &gt; 2 else '' }}</w:t>
-            </w:r>
           </w:p>
         </w:tc>
       </w:tr>
@@ -9588,9 +9426,6 @@
             <w:pPr>
               <w:jc w:val="left"/>
             </w:pPr>
-            <w:r>
-              <w:t xml:space="preserve">{{ animals[3].species if animals|length &gt; 3 else '' }}</w:t>
-            </w:r>
           </w:p>
         </w:tc>
         <w:tc>
@@ -9601,9 +9436,6 @@
             <w:pPr>
               <w:jc w:val="left"/>
             </w:pPr>
-            <w:r>
-              <w:t xml:space="preserve">{{ animals[3].strain if animals|length &gt; 3 else '' }}</w:t>
-            </w:r>
           </w:p>
         </w:tc>
         <w:tc>
@@ -9614,9 +9446,6 @@
             <w:pPr>
               <w:jc w:val="left"/>
             </w:pPr>
-            <w:r>
-              <w:t xml:space="preserve">{{ animals[3].sex if animals|length &gt; 3 else '' }}</w:t>
-            </w:r>
           </w:p>
         </w:tc>
         <w:tc>
@@ -9627,9 +9456,6 @@
             <w:pPr>
               <w:jc w:val="left"/>
             </w:pPr>
-            <w:r>
-              <w:t xml:space="preserve">{{ animals[3].age if animals|length &gt; 3 else '' }}</w:t>
-            </w:r>
           </w:p>
         </w:tc>
         <w:tc>
@@ -9640,9 +9466,6 @@
             <w:pPr>
               <w:jc w:val="left"/>
             </w:pPr>
-            <w:r>
-              <w:t xml:space="preserve">{{ animals[3].total if animals|length &gt; 3 else '' }}</w:t>
-            </w:r>
           </w:p>
         </w:tc>
         <w:tc>
@@ -9657,9 +9480,6 @@
                 <w:szCs w:val="20"/>
               </w:rPr>
             </w:pPr>
-            <w:r>
-              <w:t xml:space="preserve">{{ animals[3].source if animals|length &gt; 3 else '' }}</w:t>
-            </w:r>
           </w:p>
         </w:tc>
       </w:tr>
@@ -9672,9 +9492,6 @@
             <w:pPr>
               <w:jc w:val="left"/>
             </w:pPr>
-            <w:r>
-              <w:t xml:space="preserve">{{ animals[4].species if animals|length &gt; 4 else '' }}</w:t>
-            </w:r>
           </w:p>
         </w:tc>
         <w:tc>
@@ -9685,9 +9502,6 @@
             <w:pPr>
               <w:jc w:val="left"/>
             </w:pPr>
-            <w:r>
-              <w:t xml:space="preserve">{{ animals[4].strain if animals|length &gt; 4 else '' }}</w:t>
-            </w:r>
           </w:p>
         </w:tc>
         <w:tc>
@@ -9698,9 +9512,6 @@
             <w:pPr>
               <w:jc w:val="left"/>
             </w:pPr>
-            <w:r>
-              <w:t xml:space="preserve">{{ animals[4].sex if animals|length &gt; 4 else '' }}</w:t>
-            </w:r>
           </w:p>
         </w:tc>
         <w:tc>
@@ -9711,9 +9522,6 @@
             <w:pPr>
               <w:jc w:val="left"/>
             </w:pPr>
-            <w:r>
-              <w:t xml:space="preserve">{{ animals[4].age if animals|length &gt; 4 else '' }}</w:t>
-            </w:r>
           </w:p>
         </w:tc>
         <w:tc>
@@ -9724,9 +9532,6 @@
             <w:pPr>
               <w:jc w:val="left"/>
             </w:pPr>
-            <w:r>
-              <w:t xml:space="preserve">{{ animals[4].total if animals|length &gt; 4 else '' }}</w:t>
-            </w:r>
           </w:p>
         </w:tc>
         <w:tc>
@@ -9741,9 +9546,6 @@
                 <w:szCs w:val="20"/>
               </w:rPr>
             </w:pPr>
-            <w:r>
-              <w:t xml:space="preserve">{{ animals[4].source if animals|length &gt; 4 else '' }}</w:t>
-            </w:r>
           </w:p>
         </w:tc>
       </w:tr>
@@ -9756,9 +9558,6 @@
             <w:pPr>
               <w:jc w:val="left"/>
             </w:pPr>
-            <w:r>
-              <w:t xml:space="preserve">{{ animals[5].species if animals|length &gt; 5 else '' }}</w:t>
-            </w:r>
           </w:p>
         </w:tc>
         <w:tc>
@@ -9769,9 +9568,6 @@
             <w:pPr>
               <w:jc w:val="left"/>
             </w:pPr>
-            <w:r>
-              <w:t xml:space="preserve">{{ animals[5].strain if animals|length &gt; 5 else '' }}</w:t>
-            </w:r>
           </w:p>
           <w:p/>
           <w:p>
@@ -9788,9 +9584,6 @@
             <w:pPr>
               <w:jc w:val="left"/>
             </w:pPr>
-            <w:r>
-              <w:t xml:space="preserve">{{ animals[5].sex if animals|length &gt; 5 else '' }}</w:t>
-            </w:r>
           </w:p>
         </w:tc>
         <w:tc>
@@ -9801,9 +9594,6 @@
             <w:pPr>
               <w:jc w:val="left"/>
             </w:pPr>
-            <w:r>
-              <w:t xml:space="preserve">{{ animals[5].age if animals|length &gt; 5 else '' }}</w:t>
-            </w:r>
           </w:p>
         </w:tc>
         <w:tc>
@@ -9814,9 +9604,6 @@
             <w:pPr>
               <w:jc w:val="left"/>
             </w:pPr>
-            <w:r>
-              <w:t xml:space="preserve">{{ animals[5].total if animals|length &gt; 5 else '' }}</w:t>
-            </w:r>
           </w:p>
         </w:tc>
         <w:tc>
@@ -9831,9 +9618,6 @@
                 <w:szCs w:val="20"/>
               </w:rPr>
             </w:pPr>
-            <w:r>
-              <w:t xml:space="preserve">{{ animals[5].source if animals|length &gt; 5 else '' }}</w:t>
-            </w:r>
           </w:p>
         </w:tc>
       </w:tr>
@@ -17497,6 +17281,9 @@
             </w:sdtContent>
           </w:sdt>
           <w:p>
+            <w:pPr>
+              <w:jc w:val="left"/>
+            </w:pPr>
             <w:r>
               <w:t xml:space="preserve">{{ procedures_overview }}</w:t>
             </w:r>

</xml_diff>